<commit_message>
vault: investment slides v4 (15 slides) + MCU cheatsheet + sysadmin A02 + RTW updates
- Tom-Retirement-Portfolio v1–v4 pptx + group-workshop-tom-retirement.md
- MCU lab exam cheatsheet (md + html)
- Sysadmin assignment 02 note
- RTW writing report + late attendance docx updated
- MCU I2C plan + PCB v2 plan updated
- HOME.md + YSEALI AFP essays
</commit_message>
<xml_diff>
--- a/01-university/year-3/rtw/rtw-late-attendance-report.docx
+++ b/01-university/year-3/rtw/rtw-late-attendance-report.docx
@@ -4,12 +4,11 @@
   <w:body>
     <w:p>
       <w:pPr>
-        <w:spacing w:after="160"/>
+        <w:spacing w:after="200"/>
         <w:jc w:val="center"/>
       </w:pPr>
       <w:r>
         <w:rPr>
-          <w:rFonts w:cs="Arial"/>
           <w:b/>
           <w:bCs/>
           <w:sz w:val="28"/>
@@ -18,406 +17,160 @@
         <w:t>Report on Employee Late Attendance</w:t>
       </w:r>
     </w:p>
-    <w:tbl>
-      <w:tblPr>
-        <w:tblW w:w="9746" w:type="dxa"/>
-        <w:tblBorders>
-          <w:top w:val="single" w:sz="6" w:space="0" w:color="000000"/>
-          <w:left w:val="none" w:sz="0" w:space="0" w:color="FFFFFF"/>
-          <w:bottom w:val="single" w:sz="6" w:space="0" w:color="000000"/>
-          <w:right w:val="none" w:sz="0" w:space="0" w:color="FFFFFF"/>
-          <w:insideH w:val="single" w:sz="4" w:space="0" w:color="auto"/>
-          <w:insideV w:val="single" w:sz="4" w:space="0" w:color="auto"/>
-        </w:tblBorders>
-        <w:tblCellMar>
-          <w:left w:w="10" w:type="dxa"/>
-          <w:right w:w="10" w:type="dxa"/>
-        </w:tblCellMar>
-        <w:tblLook w:val="04A0" w:firstRow="1" w:lastRow="0" w:firstColumn="1" w:lastColumn="0" w:noHBand="0" w:noVBand="1"/>
-      </w:tblPr>
-      <w:tblGrid>
-        <w:gridCol w:w="4873"/>
-        <w:gridCol w:w="4873"/>
-      </w:tblGrid>
-      <w:tr>
-        <w:tblPrEx>
-          <w:tblCellMar>
-            <w:top w:w="0" w:type="dxa"/>
-            <w:bottom w:w="0" w:type="dxa"/>
-          </w:tblCellMar>
-        </w:tblPrEx>
-        <w:tc>
-          <w:tcPr>
-            <w:tcW w:w="4500" w:type="dxa"/>
-            <w:tcBorders>
-              <w:top w:val="none" w:sz="0" w:space="0" w:color="FFFFFF"/>
-              <w:left w:val="none" w:sz="0" w:space="0" w:color="FFFFFF"/>
-              <w:bottom w:val="none" w:sz="0" w:space="0" w:color="FFFFFF"/>
-              <w:right w:val="none" w:sz="0" w:space="0" w:color="FFFFFF"/>
-            </w:tcBorders>
-            <w:tcMar>
-              <w:top w:w="40" w:type="dxa"/>
-              <w:left w:w="80" w:type="dxa"/>
-              <w:bottom w:w="40" w:type="dxa"/>
-              <w:right w:w="80" w:type="dxa"/>
-            </w:tcMar>
-          </w:tcPr>
-          <w:p>
-            <w:r>
-              <w:rPr>
-                <w:rFonts w:cs="Arial"/>
-                <w:b/>
-                <w:bCs/>
-              </w:rPr>
-              <w:t>Prepared by:</w:t>
-            </w:r>
-          </w:p>
-        </w:tc>
-        <w:tc>
-          <w:tcPr>
-            <w:tcW w:w="4500" w:type="dxa"/>
-            <w:tcBorders>
-              <w:top w:val="none" w:sz="0" w:space="0" w:color="FFFFFF"/>
-              <w:left w:val="none" w:sz="0" w:space="0" w:color="FFFFFF"/>
-              <w:bottom w:val="none" w:sz="0" w:space="0" w:color="FFFFFF"/>
-              <w:right w:val="none" w:sz="0" w:space="0" w:color="FFFFFF"/>
-            </w:tcBorders>
-            <w:tcMar>
-              <w:top w:w="40" w:type="dxa"/>
-              <w:left w:w="80" w:type="dxa"/>
-              <w:bottom w:w="40" w:type="dxa"/>
-              <w:right w:w="80" w:type="dxa"/>
-            </w:tcMar>
-          </w:tcPr>
-          <w:p>
-            <w:r>
-              <w:rPr>
-                <w:rFonts w:cs="Arial"/>
-              </w:rPr>
-              <w:t>Napaul Intharasing</w:t>
-            </w:r>
-          </w:p>
-        </w:tc>
-      </w:tr>
-      <w:tr>
-        <w:tblPrEx>
-          <w:tblCellMar>
-            <w:top w:w="0" w:type="dxa"/>
-            <w:bottom w:w="0" w:type="dxa"/>
-          </w:tblCellMar>
-        </w:tblPrEx>
-        <w:tc>
-          <w:tcPr>
-            <w:tcW w:w="4500" w:type="dxa"/>
-            <w:tcBorders>
-              <w:top w:val="none" w:sz="0" w:space="0" w:color="FFFFFF"/>
-              <w:left w:val="none" w:sz="0" w:space="0" w:color="FFFFFF"/>
-              <w:bottom w:val="none" w:sz="0" w:space="0" w:color="FFFFFF"/>
-              <w:right w:val="none" w:sz="0" w:space="0" w:color="FFFFFF"/>
-            </w:tcBorders>
-            <w:tcMar>
-              <w:top w:w="40" w:type="dxa"/>
-              <w:left w:w="80" w:type="dxa"/>
-              <w:bottom w:w="40" w:type="dxa"/>
-              <w:right w:w="80" w:type="dxa"/>
-            </w:tcMar>
-          </w:tcPr>
-          <w:p>
-            <w:r>
-              <w:rPr>
-                <w:rFonts w:cs="Arial"/>
-                <w:b/>
-                <w:bCs/>
-              </w:rPr>
-              <w:t>Position:</w:t>
-            </w:r>
-          </w:p>
-        </w:tc>
-        <w:tc>
-          <w:tcPr>
-            <w:tcW w:w="4500" w:type="dxa"/>
-            <w:tcBorders>
-              <w:top w:val="none" w:sz="0" w:space="0" w:color="FFFFFF"/>
-              <w:left w:val="none" w:sz="0" w:space="0" w:color="FFFFFF"/>
-              <w:bottom w:val="none" w:sz="0" w:space="0" w:color="FFFFFF"/>
-              <w:right w:val="none" w:sz="0" w:space="0" w:color="FFFFFF"/>
-            </w:tcBorders>
-            <w:tcMar>
-              <w:top w:w="40" w:type="dxa"/>
-              <w:left w:w="80" w:type="dxa"/>
-              <w:bottom w:w="40" w:type="dxa"/>
-              <w:right w:w="80" w:type="dxa"/>
-            </w:tcMar>
-          </w:tcPr>
-          <w:p>
-            <w:r>
-              <w:rPr>
-                <w:rFonts w:cs="Arial"/>
-              </w:rPr>
-              <w:t>Human Resources Officer</w:t>
-            </w:r>
-          </w:p>
-        </w:tc>
-      </w:tr>
-      <w:tr>
-        <w:tblPrEx>
-          <w:tblCellMar>
-            <w:top w:w="0" w:type="dxa"/>
-            <w:bottom w:w="0" w:type="dxa"/>
-          </w:tblCellMar>
-        </w:tblPrEx>
-        <w:tc>
-          <w:tcPr>
-            <w:tcW w:w="4500" w:type="dxa"/>
-            <w:tcBorders>
-              <w:top w:val="none" w:sz="0" w:space="0" w:color="FFFFFF"/>
-              <w:left w:val="none" w:sz="0" w:space="0" w:color="FFFFFF"/>
-              <w:bottom w:val="none" w:sz="0" w:space="0" w:color="FFFFFF"/>
-              <w:right w:val="none" w:sz="0" w:space="0" w:color="FFFFFF"/>
-            </w:tcBorders>
-            <w:tcMar>
-              <w:top w:w="40" w:type="dxa"/>
-              <w:left w:w="80" w:type="dxa"/>
-              <w:bottom w:w="40" w:type="dxa"/>
-              <w:right w:w="80" w:type="dxa"/>
-            </w:tcMar>
-          </w:tcPr>
-          <w:p>
-            <w:r>
-              <w:rPr>
-                <w:rFonts w:cs="Arial"/>
-                <w:b/>
-                <w:bCs/>
-              </w:rPr>
-              <w:t>Department:</w:t>
-            </w:r>
-          </w:p>
-        </w:tc>
-        <w:tc>
-          <w:tcPr>
-            <w:tcW w:w="4500" w:type="dxa"/>
-            <w:tcBorders>
-              <w:top w:val="none" w:sz="0" w:space="0" w:color="FFFFFF"/>
-              <w:left w:val="none" w:sz="0" w:space="0" w:color="FFFFFF"/>
-              <w:bottom w:val="none" w:sz="0" w:space="0" w:color="FFFFFF"/>
-              <w:right w:val="none" w:sz="0" w:space="0" w:color="FFFFFF"/>
-            </w:tcBorders>
-            <w:tcMar>
-              <w:top w:w="40" w:type="dxa"/>
-              <w:left w:w="80" w:type="dxa"/>
-              <w:bottom w:w="40" w:type="dxa"/>
-              <w:right w:w="80" w:type="dxa"/>
-            </w:tcMar>
-          </w:tcPr>
-          <w:p>
-            <w:r>
-              <w:rPr>
-                <w:rFonts w:cs="Arial"/>
-              </w:rPr>
-              <w:t>Human Resources Department</w:t>
-            </w:r>
-          </w:p>
-        </w:tc>
-      </w:tr>
-      <w:tr>
-        <w:tblPrEx>
-          <w:tblCellMar>
-            <w:top w:w="0" w:type="dxa"/>
-            <w:bottom w:w="0" w:type="dxa"/>
-          </w:tblCellMar>
-        </w:tblPrEx>
-        <w:tc>
-          <w:tcPr>
-            <w:tcW w:w="4500" w:type="dxa"/>
-            <w:tcBorders>
-              <w:top w:val="none" w:sz="0" w:space="0" w:color="FFFFFF"/>
-              <w:left w:val="none" w:sz="0" w:space="0" w:color="FFFFFF"/>
-              <w:bottom w:val="none" w:sz="0" w:space="0" w:color="FFFFFF"/>
-              <w:right w:val="none" w:sz="0" w:space="0" w:color="FFFFFF"/>
-            </w:tcBorders>
-            <w:tcMar>
-              <w:top w:w="40" w:type="dxa"/>
-              <w:left w:w="80" w:type="dxa"/>
-              <w:bottom w:w="40" w:type="dxa"/>
-              <w:right w:w="80" w:type="dxa"/>
-            </w:tcMar>
-          </w:tcPr>
-          <w:p>
-            <w:r>
-              <w:rPr>
-                <w:rFonts w:cs="Arial"/>
-                <w:b/>
-                <w:bCs/>
-              </w:rPr>
-              <w:t>Company:</w:t>
-            </w:r>
-          </w:p>
-        </w:tc>
-        <w:tc>
-          <w:tcPr>
-            <w:tcW w:w="4500" w:type="dxa"/>
-            <w:tcBorders>
-              <w:top w:val="none" w:sz="0" w:space="0" w:color="FFFFFF"/>
-              <w:left w:val="none" w:sz="0" w:space="0" w:color="FFFFFF"/>
-              <w:bottom w:val="none" w:sz="0" w:space="0" w:color="FFFFFF"/>
-              <w:right w:val="none" w:sz="0" w:space="0" w:color="FFFFFF"/>
-            </w:tcBorders>
-            <w:tcMar>
-              <w:top w:w="40" w:type="dxa"/>
-              <w:left w:w="80" w:type="dxa"/>
-              <w:bottom w:w="40" w:type="dxa"/>
-              <w:right w:w="80" w:type="dxa"/>
-            </w:tcMar>
-          </w:tcPr>
-          <w:p>
-            <w:r>
-              <w:rPr>
-                <w:rFonts w:cs="Arial"/>
-              </w:rPr>
-              <w:t>SiamPro Manufacturing Co., Ltd.</w:t>
-            </w:r>
-          </w:p>
-        </w:tc>
-      </w:tr>
-      <w:tr>
-        <w:tblPrEx>
-          <w:tblCellMar>
-            <w:top w:w="0" w:type="dxa"/>
-            <w:bottom w:w="0" w:type="dxa"/>
-          </w:tblCellMar>
-        </w:tblPrEx>
-        <w:tc>
-          <w:tcPr>
-            <w:tcW w:w="4500" w:type="dxa"/>
-            <w:tcBorders>
-              <w:top w:val="none" w:sz="0" w:space="0" w:color="FFFFFF"/>
-              <w:left w:val="none" w:sz="0" w:space="0" w:color="FFFFFF"/>
-              <w:bottom w:val="none" w:sz="0" w:space="0" w:color="FFFFFF"/>
-              <w:right w:val="none" w:sz="0" w:space="0" w:color="FFFFFF"/>
-            </w:tcBorders>
-            <w:tcMar>
-              <w:top w:w="40" w:type="dxa"/>
-              <w:left w:w="80" w:type="dxa"/>
-              <w:bottom w:w="40" w:type="dxa"/>
-              <w:right w:w="80" w:type="dxa"/>
-            </w:tcMar>
-          </w:tcPr>
-          <w:p>
-            <w:r>
-              <w:rPr>
-                <w:rFonts w:cs="Arial"/>
-                <w:b/>
-                <w:bCs/>
-              </w:rPr>
-              <w:t>Reporting Period:</w:t>
-            </w:r>
-          </w:p>
-        </w:tc>
-        <w:tc>
-          <w:tcPr>
-            <w:tcW w:w="4500" w:type="dxa"/>
-            <w:tcBorders>
-              <w:top w:val="none" w:sz="0" w:space="0" w:color="FFFFFF"/>
-              <w:left w:val="none" w:sz="0" w:space="0" w:color="FFFFFF"/>
-              <w:bottom w:val="none" w:sz="0" w:space="0" w:color="FFFFFF"/>
-              <w:right w:val="none" w:sz="0" w:space="0" w:color="FFFFFF"/>
-            </w:tcBorders>
-            <w:tcMar>
-              <w:top w:w="40" w:type="dxa"/>
-              <w:left w:w="80" w:type="dxa"/>
-              <w:bottom w:w="40" w:type="dxa"/>
-              <w:right w:w="80" w:type="dxa"/>
-            </w:tcMar>
-          </w:tcPr>
-          <w:p>
-            <w:r>
-              <w:rPr>
-                <w:rFonts w:cs="Arial"/>
-              </w:rPr>
-              <w:t>August 2026</w:t>
-            </w:r>
-          </w:p>
-        </w:tc>
-      </w:tr>
-      <w:tr>
-        <w:tblPrEx>
-          <w:tblCellMar>
-            <w:top w:w="0" w:type="dxa"/>
-            <w:bottom w:w="0" w:type="dxa"/>
-          </w:tblCellMar>
-        </w:tblPrEx>
-        <w:tc>
-          <w:tcPr>
-            <w:tcW w:w="4500" w:type="dxa"/>
-            <w:tcBorders>
-              <w:top w:val="none" w:sz="0" w:space="0" w:color="FFFFFF"/>
-              <w:left w:val="none" w:sz="0" w:space="0" w:color="FFFFFF"/>
-              <w:bottom w:val="none" w:sz="0" w:space="0" w:color="FFFFFF"/>
-              <w:right w:val="none" w:sz="0" w:space="0" w:color="FFFFFF"/>
-            </w:tcBorders>
-            <w:tcMar>
-              <w:top w:w="40" w:type="dxa"/>
-              <w:left w:w="80" w:type="dxa"/>
-              <w:bottom w:w="40" w:type="dxa"/>
-              <w:right w:w="80" w:type="dxa"/>
-            </w:tcMar>
-          </w:tcPr>
-          <w:p>
-            <w:r>
-              <w:rPr>
-                <w:rFonts w:cs="Arial"/>
-                <w:b/>
-                <w:bCs/>
-              </w:rPr>
-              <w:t>Date Submitted:</w:t>
-            </w:r>
-          </w:p>
-        </w:tc>
-        <w:tc>
-          <w:tcPr>
-            <w:tcW w:w="4500" w:type="dxa"/>
-            <w:tcBorders>
-              <w:top w:val="none" w:sz="0" w:space="0" w:color="FFFFFF"/>
-              <w:left w:val="none" w:sz="0" w:space="0" w:color="FFFFFF"/>
-              <w:bottom w:val="none" w:sz="0" w:space="0" w:color="FFFFFF"/>
-              <w:right w:val="none" w:sz="0" w:space="0" w:color="FFFFFF"/>
-            </w:tcBorders>
-            <w:tcMar>
-              <w:top w:w="40" w:type="dxa"/>
-              <w:left w:w="80" w:type="dxa"/>
-              <w:bottom w:w="40" w:type="dxa"/>
-              <w:right w:w="80" w:type="dxa"/>
-            </w:tcMar>
-          </w:tcPr>
-          <w:p>
-            <w:r>
-              <w:rPr>
-                <w:rFonts w:cs="Arial"/>
-              </w:rPr>
-              <w:t>24 September 2026</w:t>
-            </w:r>
-          </w:p>
-        </w:tc>
-      </w:tr>
-    </w:tbl>
+    <w:p>
+      <w:pPr>
+        <w:spacing w:after="60"/>
+      </w:pPr>
+      <w:r>
+        <w:rPr>
+          <w:b/>
+          <w:bCs/>
+          <w:sz w:val="22"/>
+          <w:szCs w:val="22"/>
+        </w:rPr>
+        <w:t xml:space="preserve">Prepared by: </w:t>
+      </w:r>
+      <w:r>
+        <w:rPr>
+          <w:sz w:val="22"/>
+          <w:szCs w:val="22"/>
+        </w:rPr>
+        <w:t>Napaul Intharasing</w:t>
+      </w:r>
+    </w:p>
+    <w:p>
+      <w:pPr>
+        <w:spacing w:after="60"/>
+      </w:pPr>
+      <w:r>
+        <w:rPr>
+          <w:b/>
+          <w:bCs/>
+          <w:sz w:val="22"/>
+          <w:szCs w:val="22"/>
+        </w:rPr>
+        <w:t xml:space="preserve">Position: </w:t>
+      </w:r>
+      <w:r>
+        <w:rPr>
+          <w:sz w:val="22"/>
+          <w:szCs w:val="22"/>
+        </w:rPr>
+        <w:t>Human Resources Officer</w:t>
+      </w:r>
+    </w:p>
+    <w:p>
+      <w:pPr>
+        <w:spacing w:after="60"/>
+      </w:pPr>
+      <w:r>
+        <w:rPr>
+          <w:b/>
+          <w:bCs/>
+          <w:sz w:val="22"/>
+          <w:szCs w:val="22"/>
+        </w:rPr>
+        <w:t xml:space="preserve">Department: </w:t>
+      </w:r>
+      <w:r>
+        <w:rPr>
+          <w:sz w:val="22"/>
+          <w:szCs w:val="22"/>
+        </w:rPr>
+        <w:t>Human Resources Department</w:t>
+      </w:r>
+    </w:p>
+    <w:p>
+      <w:pPr>
+        <w:spacing w:after="60"/>
+      </w:pPr>
+      <w:r>
+        <w:rPr>
+          <w:b/>
+          <w:bCs/>
+          <w:sz w:val="22"/>
+          <w:szCs w:val="22"/>
+        </w:rPr>
+        <w:t xml:space="preserve">Company: </w:t>
+      </w:r>
+      <w:r>
+        <w:rPr>
+          <w:sz w:val="22"/>
+          <w:szCs w:val="22"/>
+        </w:rPr>
+        <w:t>SiamPro Manufacturing Co., Ltd.</w:t>
+      </w:r>
+    </w:p>
+    <w:p>
+      <w:pPr>
+        <w:spacing w:after="60"/>
+      </w:pPr>
+      <w:r>
+        <w:rPr>
+          <w:b/>
+          <w:bCs/>
+          <w:sz w:val="22"/>
+          <w:szCs w:val="22"/>
+        </w:rPr>
+        <w:t xml:space="preserve">Reporting Period: </w:t>
+      </w:r>
+      <w:r>
+        <w:rPr>
+          <w:sz w:val="22"/>
+          <w:szCs w:val="22"/>
+        </w:rPr>
+        <w:t>August 2026</w:t>
+      </w:r>
+    </w:p>
     <w:p>
       <w:pPr>
         <w:pBdr>
-          <w:bottom w:val="single" w:sz="8" w:space="1" w:color="000000"/>
+          <w:bottom w:val="single" w:sz="6" w:space="1" w:color="auto"/>
         </w:pBdr>
-        <w:spacing w:before="160"/>
-      </w:pPr>
-    </w:p>
-    <w:p>
-      <w:pPr>
-        <w:spacing w:before="160" w:after="60"/>
-      </w:pPr>
-      <w:r>
-        <w:rPr>
-          <w:rFonts w:cs="Arial"/>
-          <w:b/>
-          <w:bCs/>
-          <w:color w:val="000000"/>
+        <w:spacing w:after="60"/>
+        <w:rPr>
+          <w:sz w:val="22"/>
+          <w:szCs w:val="22"/>
+        </w:rPr>
+      </w:pPr>
+      <w:r>
+        <w:rPr>
+          <w:b/>
+          <w:bCs/>
+          <w:sz w:val="22"/>
+          <w:szCs w:val="22"/>
+        </w:rPr>
+        <w:t xml:space="preserve">Date Submitted: </w:t>
+      </w:r>
+      <w:r>
+        <w:rPr>
+          <w:sz w:val="22"/>
+          <w:szCs w:val="22"/>
+        </w:rPr>
+        <w:t>24 September 2026</w:t>
+      </w:r>
+    </w:p>
+    <w:p>
+      <w:pPr>
+        <w:pBdr>
+          <w:bottom w:val="single" w:sz="6" w:space="1" w:color="auto"/>
+        </w:pBdr>
+        <w:spacing w:after="60"/>
+        <w:rPr>
+          <w:sz w:val="22"/>
+          <w:szCs w:val="22"/>
+        </w:rPr>
+      </w:pPr>
+    </w:p>
+    <w:p/>
+    <w:p>
+      <w:pPr>
+        <w:spacing w:after="120"/>
+      </w:pPr>
+      <w:r>
+        <w:rPr>
+          <w:b/>
+          <w:bCs/>
           <w:sz w:val="24"/>
           <w:szCs w:val="24"/>
         </w:rPr>
@@ -426,25 +179,24 @@
     </w:p>
     <w:p>
       <w:pPr>
-        <w:spacing w:before="60" w:after="60"/>
-      </w:pPr>
-      <w:r>
-        <w:rPr>
-          <w:rFonts w:cs="Arial"/>
-        </w:rPr>
-        <w:t>This report aims to identify the causes of late attendance among Production Department employees in August 2026 and recommend actions to prevent recurrence.</w:t>
-      </w:r>
-    </w:p>
-    <w:p>
-      <w:pPr>
-        <w:spacing w:before="160" w:after="60"/>
-      </w:pPr>
-      <w:r>
-        <w:rPr>
-          <w:rFonts w:cs="Arial"/>
-          <w:b/>
-          <w:bCs/>
-          <w:color w:val="000000"/>
+        <w:spacing w:after="160"/>
+      </w:pPr>
+      <w:r>
+        <w:rPr>
+          <w:sz w:val="22"/>
+          <w:szCs w:val="22"/>
+        </w:rPr>
+        <w:t>This report examines the causes of late attendance among Production Department employees in August 2026 and recommends actions to reduce delays and disruptions in the following month.</w:t>
+      </w:r>
+    </w:p>
+    <w:p>
+      <w:pPr>
+        <w:spacing w:before="240" w:after="120"/>
+      </w:pPr>
+      <w:r>
+        <w:rPr>
+          <w:b/>
+          <w:bCs/>
           <w:sz w:val="24"/>
           <w:szCs w:val="24"/>
         </w:rPr>
@@ -453,25 +205,24 @@
     </w:p>
     <w:p>
       <w:pPr>
-        <w:spacing w:before="60" w:after="60"/>
-      </w:pPr>
-      <w:r>
-        <w:rPr>
-          <w:rFonts w:cs="Arial"/>
-        </w:rPr>
-        <w:t>The Human Resources Department reviewed attendance records after the Production Manager reported repeated delays at shift start times throughout August 2026.</w:t>
-      </w:r>
-    </w:p>
-    <w:p>
-      <w:pPr>
-        <w:spacing w:before="160" w:after="60"/>
-      </w:pPr>
-      <w:r>
-        <w:rPr>
-          <w:rFonts w:cs="Arial"/>
-          <w:b/>
-          <w:bCs/>
-          <w:color w:val="000000"/>
+        <w:spacing w:after="160"/>
+      </w:pPr>
+      <w:r>
+        <w:rPr>
+          <w:sz w:val="22"/>
+          <w:szCs w:val="22"/>
+        </w:rPr>
+        <w:t>In August 2026, the Production Manager reported repeated delays at shift start times, and the HR Department was asked to investigate.</w:t>
+      </w:r>
+    </w:p>
+    <w:p>
+      <w:pPr>
+        <w:spacing w:before="240" w:after="120"/>
+      </w:pPr>
+      <w:r>
+        <w:rPr>
+          <w:b/>
+          <w:bCs/>
           <w:sz w:val="24"/>
           <w:szCs w:val="24"/>
         </w:rPr>
@@ -480,64 +231,24 @@
     </w:p>
     <w:p>
       <w:pPr>
-        <w:spacing w:before="60" w:after="60"/>
-      </w:pPr>
-      <w:r>
-        <w:rPr>
-          <w:rFonts w:cs="Arial"/>
-        </w:rPr>
-        <w:t>During this reporting period, the HR Department:</w:t>
-      </w:r>
-    </w:p>
-    <w:p>
-      <w:pPr>
-        <w:pStyle w:val="ListParagraph"/>
-        <w:numPr>
-          <w:ilvl w:val="0"/>
-          <w:numId w:val="2"/>
-        </w:numPr>
-        <w:spacing w:before="40" w:after="40"/>
-      </w:pPr>
-      <w:r>
-        <w:t>Reviewed attendance records for all 30 Production Department employees</w:t>
-      </w:r>
-    </w:p>
-    <w:p>
-      <w:pPr>
-        <w:pStyle w:val="ListParagraph"/>
-        <w:numPr>
-          <w:ilvl w:val="0"/>
-          <w:numId w:val="2"/>
-        </w:numPr>
-        <w:spacing w:before="40" w:after="40"/>
-      </w:pPr>
-      <w:r>
-        <w:t>Conducted individual interviews to identify reasons for late arrivals</w:t>
-      </w:r>
-    </w:p>
-    <w:p>
-      <w:pPr>
-        <w:pStyle w:val="ListParagraph"/>
-        <w:numPr>
-          <w:ilvl w:val="0"/>
-          <w:numId w:val="2"/>
-        </w:numPr>
-        <w:spacing w:before="40" w:after="40"/>
-      </w:pPr>
-      <w:r>
-        <w:t>Compiled findings and prepared this report for management review</w:t>
-      </w:r>
-    </w:p>
-    <w:p>
-      <w:pPr>
-        <w:spacing w:before="160" w:after="60"/>
-      </w:pPr>
-      <w:r>
-        <w:rPr>
-          <w:rFonts w:cs="Arial"/>
-          <w:b/>
-          <w:bCs/>
-          <w:color w:val="000000"/>
+        <w:spacing w:after="160"/>
+      </w:pPr>
+      <w:r>
+        <w:rPr>
+          <w:sz w:val="22"/>
+          <w:szCs w:val="22"/>
+        </w:rPr>
+        <w:t>The HR Department reviewed attendance records for all 30 Production Department employees and conducted individual interviews with employees who had been marked late.</w:t>
+      </w:r>
+    </w:p>
+    <w:p>
+      <w:pPr>
+        <w:spacing w:before="240" w:after="120"/>
+      </w:pPr>
+      <w:r>
+        <w:rPr>
+          <w:b/>
+          <w:bCs/>
           <w:sz w:val="24"/>
           <w:szCs w:val="24"/>
         </w:rPr>
@@ -546,25 +257,24 @@
     </w:p>
     <w:p>
       <w:pPr>
-        <w:spacing w:before="60" w:after="60"/>
-      </w:pPr>
-      <w:r>
-        <w:rPr>
-          <w:rFonts w:cs="Arial"/>
-        </w:rPr>
-        <w:t>The review found that 12 out of 30 employees (40%) arrived late at least once, with 35 late arrivals recorded in total. As a result, the production line started 10 to 15 minutes late on multiple occasions, reducing daily output.</w:t>
-      </w:r>
-    </w:p>
-    <w:p>
-      <w:pPr>
-        <w:spacing w:before="160" w:after="60"/>
-      </w:pPr>
-      <w:r>
-        <w:rPr>
-          <w:rFonts w:cs="Arial"/>
-          <w:b/>
-          <w:bCs/>
-          <w:color w:val="000000"/>
+        <w:spacing w:after="160"/>
+      </w:pPr>
+      <w:r>
+        <w:rPr>
+          <w:sz w:val="22"/>
+          <w:szCs w:val="22"/>
+        </w:rPr>
+        <w:t>The review found that 12 out of 30 employees, which is 40 percent of the workforce, had arrived late at least once, with 35 total late arrivals recorded and the production line starting 10 to 15 minutes late on several occasions.</w:t>
+      </w:r>
+    </w:p>
+    <w:p>
+      <w:pPr>
+        <w:spacing w:before="240" w:after="120"/>
+      </w:pPr>
+      <w:r>
+        <w:rPr>
+          <w:b/>
+          <w:bCs/>
           <w:sz w:val="24"/>
           <w:szCs w:val="24"/>
         </w:rPr>
@@ -573,25 +283,24 @@
     </w:p>
     <w:p>
       <w:pPr>
-        <w:spacing w:before="60" w:after="60"/>
-      </w:pPr>
-      <w:r>
-        <w:rPr>
-          <w:rFonts w:cs="Arial"/>
-        </w:rPr>
-        <w:t>The main causes reported by employees included heavy traffic congestion, long commuting distances, shuttle bus breakdowns with no backup schedule, and oversleeping due to early shift start times.</w:t>
-      </w:r>
-    </w:p>
-    <w:p>
-      <w:pPr>
-        <w:spacing w:before="160" w:after="60"/>
-      </w:pPr>
-      <w:r>
-        <w:rPr>
-          <w:rFonts w:cs="Arial"/>
-          <w:b/>
-          <w:bCs/>
-          <w:color w:val="000000"/>
+        <w:spacing w:after="160"/>
+      </w:pPr>
+      <w:r>
+        <w:rPr>
+          <w:sz w:val="22"/>
+          <w:szCs w:val="22"/>
+        </w:rPr>
+        <w:t>The main difficulties and challenges reported were heavy traffic congestion, long commuting distances, and shuttle bus breakdowns. Furthermore, a number of employees also mentioned oversleeping due to the early shift start time.</w:t>
+      </w:r>
+    </w:p>
+    <w:p>
+      <w:pPr>
+        <w:spacing w:before="240" w:after="120"/>
+      </w:pPr>
+      <w:r>
+        <w:rPr>
+          <w:b/>
+          <w:bCs/>
           <w:sz w:val="24"/>
           <w:szCs w:val="24"/>
         </w:rPr>
@@ -600,25 +309,24 @@
     </w:p>
     <w:p>
       <w:pPr>
-        <w:spacing w:before="60" w:after="60"/>
-      </w:pPr>
-      <w:r>
-        <w:rPr>
-          <w:rFonts w:cs="Arial"/>
-        </w:rPr>
-        <w:t>The HR Department issued verbal reminders to employees with repeated late arrivals and notified the Production Manager of the attendance patterns identified in this review.</w:t>
-      </w:r>
-    </w:p>
-    <w:p>
-      <w:pPr>
-        <w:spacing w:before="160" w:after="60"/>
-      </w:pPr>
-      <w:r>
-        <w:rPr>
-          <w:rFonts w:cs="Arial"/>
-          <w:b/>
-          <w:bCs/>
-          <w:color w:val="000000"/>
+        <w:spacing w:after="160"/>
+      </w:pPr>
+      <w:r>
+        <w:rPr>
+          <w:sz w:val="22"/>
+          <w:szCs w:val="22"/>
+        </w:rPr>
+        <w:t>The HR Department issued verbal reminders to employees with repeated late arrivals and notified the Production Manager of the attendance patterns and concerns identified in this review.</w:t>
+      </w:r>
+    </w:p>
+    <w:p>
+      <w:pPr>
+        <w:spacing w:before="240" w:after="120"/>
+      </w:pPr>
+      <w:r>
+        <w:rPr>
+          <w:b/>
+          <w:bCs/>
           <w:sz w:val="24"/>
           <w:szCs w:val="24"/>
         </w:rPr>
@@ -627,53 +335,24 @@
     </w:p>
     <w:p>
       <w:pPr>
-        <w:pStyle w:val="ListParagraph"/>
-        <w:numPr>
-          <w:ilvl w:val="0"/>
-          <w:numId w:val="2"/>
-        </w:numPr>
-        <w:spacing w:before="40" w:after="40"/>
-      </w:pPr>
-      <w:r>
-        <w:t>Arrange an earlier morning shuttle to reduce the impact of peak traffic</w:t>
-      </w:r>
-    </w:p>
-    <w:p>
-      <w:pPr>
-        <w:pStyle w:val="ListParagraph"/>
-        <w:numPr>
-          <w:ilvl w:val="0"/>
-          <w:numId w:val="2"/>
-        </w:numPr>
-        <w:spacing w:before="40" w:after="40"/>
-      </w:pPr>
-      <w:r>
-        <w:t>Introduce flexible start times for employees with long commuting distances</w:t>
-      </w:r>
-    </w:p>
-    <w:p>
-      <w:pPr>
-        <w:pStyle w:val="ListParagraph"/>
-        <w:numPr>
-          <w:ilvl w:val="0"/>
-          <w:numId w:val="2"/>
-        </w:numPr>
-        <w:spacing w:before="40" w:after="40"/>
-      </w:pPr>
-      <w:r>
-        <w:t>Review attendance records monthly to detect patterns early</w:t>
-      </w:r>
-    </w:p>
-    <w:p>
-      <w:pPr>
-        <w:spacing w:before="160" w:after="60"/>
-      </w:pPr>
-      <w:r>
-        <w:rPr>
-          <w:rFonts w:cs="Arial"/>
-          <w:b/>
-          <w:bCs/>
-          <w:color w:val="000000"/>
+        <w:spacing w:after="160"/>
+      </w:pPr>
+      <w:r>
+        <w:rPr>
+          <w:sz w:val="22"/>
+          <w:szCs w:val="22"/>
+        </w:rPr>
+        <w:t>The department recommends arranging an earlier morning shuttle, introducing flexible start times for employees with long commuting distances, and reviewing attendance records monthly to detect recurring patterns.</w:t>
+      </w:r>
+    </w:p>
+    <w:p>
+      <w:pPr>
+        <w:spacing w:before="240" w:after="120"/>
+      </w:pPr>
+      <w:r>
+        <w:rPr>
+          <w:b/>
+          <w:bCs/>
           <w:sz w:val="24"/>
           <w:szCs w:val="24"/>
         </w:rPr>
@@ -682,25 +361,24 @@
     </w:p>
     <w:p>
       <w:pPr>
-        <w:spacing w:before="60" w:after="60"/>
-      </w:pPr>
-      <w:r>
-        <w:rPr>
-          <w:rFonts w:cs="Arial"/>
-        </w:rPr>
-        <w:t>During the next reporting period, the department will present these recommendations to senior management, monitor attendance records weekly, and follow up with employees on available transportation arrangements.</w:t>
-      </w:r>
-    </w:p>
-    <w:p>
-      <w:pPr>
-        <w:spacing w:before="160" w:after="60"/>
-      </w:pPr>
-      <w:r>
-        <w:rPr>
-          <w:rFonts w:cs="Arial"/>
-          <w:b/>
-          <w:bCs/>
-          <w:color w:val="000000"/>
+        <w:spacing w:after="160"/>
+      </w:pPr>
+      <w:r>
+        <w:rPr>
+          <w:sz w:val="22"/>
+          <w:szCs w:val="22"/>
+        </w:rPr>
+        <w:t>These recommendations will be presented to senior management, and attendance records will be monitored on a weekly basis.</w:t>
+      </w:r>
+    </w:p>
+    <w:p>
+      <w:pPr>
+        <w:spacing w:before="240" w:after="120"/>
+      </w:pPr>
+      <w:r>
+        <w:rPr>
+          <w:b/>
+          <w:bCs/>
           <w:sz w:val="24"/>
           <w:szCs w:val="24"/>
         </w:rPr>
@@ -709,18 +387,19 @@
     </w:p>
     <w:p>
       <w:pPr>
-        <w:spacing w:before="60" w:after="60"/>
-      </w:pPr>
-      <w:r>
-        <w:rPr>
-          <w:rFonts w:cs="Arial"/>
-        </w:rPr>
-        <w:t>Late arrivals in August 2026 stemmed mainly from transportation and commuting difficulties. With revised shuttle arrangements and flexible scheduling, the department expects attendance to improve in the following month.</w:t>
+        <w:spacing w:after="160"/>
+      </w:pPr>
+      <w:r>
+        <w:rPr>
+          <w:sz w:val="22"/>
+          <w:szCs w:val="22"/>
+        </w:rPr>
+        <w:t>Late arrivals in August 2026 stemmed mainly from transportation difficulties and commuting problems, and the department expects improvements once the recommended changes are in place.</w:t>
       </w:r>
     </w:p>
     <w:sectPr>
       <w:pgSz w:w="11906" w:h="16838"/>
-      <w:pgMar w:top="1080" w:right="1080" w:bottom="1080" w:left="1080" w:header="708" w:footer="708" w:gutter="0"/>
+      <w:pgMar w:top="1440" w:right="1440" w:bottom="1440" w:left="1440" w:header="708" w:footer="708" w:gutter="0"/>
       <w:cols w:space="720"/>
       <w:docGrid w:linePitch="360"/>
     </w:sectPr>
@@ -731,64 +410,10 @@
 <file path=word/numbering.xml><?xml version="1.0" encoding="utf-8"?>
 <w:numbering xmlns:wpc="http://schemas.microsoft.com/office/word/2010/wordprocessingCanvas" xmlns:cx="http://schemas.microsoft.com/office/drawing/2014/chartex" xmlns:cx1="http://schemas.microsoft.com/office/drawing/2015/9/8/chartex" xmlns:cx2="http://schemas.microsoft.com/office/drawing/2015/10/21/chartex" xmlns:cx3="http://schemas.microsoft.com/office/drawing/2016/5/9/chartex" xmlns:cx4="http://schemas.microsoft.com/office/drawing/2016/5/10/chartex" xmlns:cx5="http://schemas.microsoft.com/office/drawing/2016/5/11/chartex" xmlns:cx6="http://schemas.microsoft.com/office/drawing/2016/5/12/chartex" xmlns:cx7="http://schemas.microsoft.com/office/drawing/2016/5/13/chartex" xmlns:cx8="http://schemas.microsoft.com/office/drawing/2016/5/14/chartex" xmlns:mc="http://schemas.openxmlformats.org/markup-compatibility/2006" xmlns:m="http://schemas.openxmlformats.org/officeDocument/2006/math" xmlns:aink="http://schemas.microsoft.com/office/drawing/2016/ink" xmlns:am3d="http://schemas.microsoft.com/office/drawing/2017/model3d" xmlns:oel="http://schemas.microsoft.com/office/2019/extlst" xmlns:r="http://schemas.openxmlformats.org/officeDocument/2006/relationships" xmlns:wp14="http://schemas.microsoft.com/office/word/2010/wordprocessingDrawing" xmlns:wp="http://schemas.openxmlformats.org/drawingml/2006/wordprocessingDrawing" xmlns:wpg="http://schemas.microsoft.com/office/word/2010/wordprocessingGroup" xmlns:wpi="http://schemas.microsoft.com/office/word/2010/wordprocessingInk" xmlns:wps="http://schemas.microsoft.com/office/word/2010/wordprocessingShape" xmlns:o="urn:schemas-microsoft-com:office:office" xmlns:v="urn:schemas-microsoft-com:vml" xmlns:w10="urn:schemas-microsoft-com:office:word" xmlns:w="http://schemas.openxmlformats.org/wordprocessingml/2006/main" xmlns:w14="http://schemas.microsoft.com/office/word/2010/wordml" xmlns:w15="http://schemas.microsoft.com/office/word/2012/wordml" xmlns:w16cei="http://schemas.microsoft.com/office/word/2026/wordml/cei" xmlns:w16cex="http://schemas.microsoft.com/office/word/2018/wordml/cex" xmlns:w16cid="http://schemas.microsoft.com/office/word/2016/wordml/cid" xmlns:w16="http://schemas.microsoft.com/office/word/2018/wordml" xmlns:w16sdtdh="http://schemas.microsoft.com/office/word/2020/wordml/sdtdatahash" xmlns:w16sdtfl="http://schemas.microsoft.com/office/word/2024/wordml/sdtformatlock" xmlns:w16se="http://schemas.microsoft.com/office/word/2015/wordml/symex" xmlns:w16du="http://schemas.microsoft.com/office/word/2023/wordml/word16du" xmlns:wne="http://schemas.microsoft.com/office/word/2006/wordml" mc:Ignorable="w14 w15 w16se w16cid w16 w16cex w16sdtdh w16sdtfl w16du wp14">
   <w:abstractNum w:abstractNumId="0" w15:restartNumberingAfterBreak="0">
-    <w:nsid w:val="2C7B28E4"/>
+    <w:nsid w:val="7C081E82"/>
     <w:multiLevelType w:val="hybridMultilevel"/>
-    <w:tmpl w:val="C606703E"/>
-    <w:lvl w:ilvl="0" w:tplc="9EAA8C94">
-      <w:start w:val="1"/>
-      <w:numFmt w:val="bullet"/>
-      <w:lvlText w:val="•"/>
-      <w:lvlJc w:val="left"/>
-      <w:pPr>
-        <w:ind w:left="720" w:hanging="360"/>
-      </w:pPr>
-    </w:lvl>
-    <w:lvl w:ilvl="1" w:tplc="7D188EF0">
-      <w:numFmt w:val="decimal"/>
-      <w:lvlText w:val=""/>
-      <w:lvlJc w:val="left"/>
-    </w:lvl>
-    <w:lvl w:ilvl="2" w:tplc="2550DA8C">
-      <w:numFmt w:val="decimal"/>
-      <w:lvlText w:val=""/>
-      <w:lvlJc w:val="left"/>
-    </w:lvl>
-    <w:lvl w:ilvl="3" w:tplc="C8B2EE2C">
-      <w:numFmt w:val="decimal"/>
-      <w:lvlText w:val=""/>
-      <w:lvlJc w:val="left"/>
-    </w:lvl>
-    <w:lvl w:ilvl="4" w:tplc="A15CD896">
-      <w:numFmt w:val="decimal"/>
-      <w:lvlText w:val=""/>
-      <w:lvlJc w:val="left"/>
-    </w:lvl>
-    <w:lvl w:ilvl="5" w:tplc="AF82B37C">
-      <w:numFmt w:val="decimal"/>
-      <w:lvlText w:val=""/>
-      <w:lvlJc w:val="left"/>
-    </w:lvl>
-    <w:lvl w:ilvl="6" w:tplc="4712152A">
-      <w:numFmt w:val="decimal"/>
-      <w:lvlText w:val=""/>
-      <w:lvlJc w:val="left"/>
-    </w:lvl>
-    <w:lvl w:ilvl="7" w:tplc="4C689368">
-      <w:numFmt w:val="decimal"/>
-      <w:lvlText w:val=""/>
-      <w:lvlJc w:val="left"/>
-    </w:lvl>
-    <w:lvl w:ilvl="8" w:tplc="A244810A">
-      <w:numFmt w:val="decimal"/>
-      <w:lvlText w:val=""/>
-      <w:lvlJc w:val="left"/>
-    </w:lvl>
-  </w:abstractNum>
-  <w:abstractNum w:abstractNumId="1" w15:restartNumberingAfterBreak="0">
-    <w:nsid w:val="625E074C"/>
-    <w:multiLevelType w:val="hybridMultilevel"/>
-    <w:tmpl w:val="36D4BF8E"/>
-    <w:lvl w:ilvl="0" w:tplc="483489D2">
+    <w:tmpl w:val="40820E48"/>
+    <w:lvl w:ilvl="0" w:tplc="400A2FFC">
       <w:start w:val="1"/>
       <w:numFmt w:val="bullet"/>
       <w:lvlText w:val="●"/>
@@ -797,7 +422,7 @@
         <w:ind w:left="720" w:hanging="360"/>
       </w:pPr>
     </w:lvl>
-    <w:lvl w:ilvl="1" w:tplc="BFD86D18">
+    <w:lvl w:ilvl="1" w:tplc="2D9AB456">
       <w:start w:val="1"/>
       <w:numFmt w:val="bullet"/>
       <w:lvlText w:val="○"/>
@@ -806,7 +431,7 @@
         <w:ind w:left="1440" w:hanging="360"/>
       </w:pPr>
     </w:lvl>
-    <w:lvl w:ilvl="2" w:tplc="BE6CAFC6">
+    <w:lvl w:ilvl="2" w:tplc="EE8AD232">
       <w:start w:val="1"/>
       <w:numFmt w:val="bullet"/>
       <w:lvlText w:val="■"/>
@@ -815,7 +440,7 @@
         <w:ind w:left="2160" w:hanging="360"/>
       </w:pPr>
     </w:lvl>
-    <w:lvl w:ilvl="3" w:tplc="BB3C9156">
+    <w:lvl w:ilvl="3" w:tplc="5BB6C308">
       <w:start w:val="1"/>
       <w:numFmt w:val="bullet"/>
       <w:lvlText w:val="●"/>
@@ -824,7 +449,7 @@
         <w:ind w:left="2880" w:hanging="360"/>
       </w:pPr>
     </w:lvl>
-    <w:lvl w:ilvl="4" w:tplc="F32EEC9E">
+    <w:lvl w:ilvl="4" w:tplc="C4826B52">
       <w:start w:val="1"/>
       <w:numFmt w:val="bullet"/>
       <w:lvlText w:val="○"/>
@@ -833,7 +458,7 @@
         <w:ind w:left="3600" w:hanging="360"/>
       </w:pPr>
     </w:lvl>
-    <w:lvl w:ilvl="5" w:tplc="EC74DA54">
+    <w:lvl w:ilvl="5" w:tplc="82CC32E2">
       <w:start w:val="1"/>
       <w:numFmt w:val="bullet"/>
       <w:lvlText w:val="■"/>
@@ -842,7 +467,7 @@
         <w:ind w:left="4320" w:hanging="360"/>
       </w:pPr>
     </w:lvl>
-    <w:lvl w:ilvl="6" w:tplc="61CC6EA6">
+    <w:lvl w:ilvl="6" w:tplc="588C8496">
       <w:start w:val="1"/>
       <w:numFmt w:val="bullet"/>
       <w:lvlText w:val="●"/>
@@ -851,7 +476,7 @@
         <w:ind w:left="5040" w:hanging="360"/>
       </w:pPr>
     </w:lvl>
-    <w:lvl w:ilvl="7" w:tplc="31481A02">
+    <w:lvl w:ilvl="7" w:tplc="DDC6AFA0">
       <w:start w:val="1"/>
       <w:numFmt w:val="bullet"/>
       <w:lvlText w:val="●"/>
@@ -860,7 +485,7 @@
         <w:ind w:left="5760" w:hanging="360"/>
       </w:pPr>
     </w:lvl>
-    <w:lvl w:ilvl="8" w:tplc="466867E2">
+    <w:lvl w:ilvl="8" w:tplc="1556F792">
       <w:start w:val="1"/>
       <w:numFmt w:val="bullet"/>
       <w:lvlText w:val="●"/>
@@ -870,13 +495,7 @@
       </w:pPr>
     </w:lvl>
   </w:abstractNum>
-  <w:num w:numId="1" w16cid:durableId="1592855417">
-    <w:abstractNumId w:val="1"/>
-    <w:lvlOverride w:ilvl="0">
-      <w:startOverride w:val="1"/>
-    </w:lvlOverride>
-  </w:num>
-  <w:num w:numId="2" w16cid:durableId="657076531">
+  <w:num w:numId="1" w16cid:durableId="1731879417">
     <w:abstractNumId w:val="0"/>
     <w:lvlOverride w:ilvl="0">
       <w:startOverride w:val="1"/>
@@ -890,9 +509,7 @@
   <w:docDefaults>
     <w:rPrDefault>
       <w:rPr>
-        <w:rFonts w:ascii="Arial" w:eastAsia="Arial" w:hAnsi="Arial" w:cs="Arial"/>
-        <w:sz w:val="22"/>
-        <w:szCs w:val="22"/>
+        <w:rFonts w:ascii="Times New Roman" w:eastAsia="Times New Roman" w:hAnsi="Times New Roman" w:cs="Times New Roman"/>
         <w:lang w:val="en-TH" w:eastAsia="en-US" w:bidi="th-TH"/>
       </w:rPr>
     </w:rPrDefault>
@@ -1439,10 +1056,6 @@
     <w:uiPriority w:val="99"/>
     <w:semiHidden/>
     <w:unhideWhenUsed/>
-    <w:rPr>
-      <w:sz w:val="20"/>
-      <w:szCs w:val="20"/>
-    </w:rPr>
   </w:style>
   <w:style w:type="character" w:customStyle="1" w:styleId="FootnoteTextChar">
     <w:name w:val="Footnote Text Char"/>
@@ -1470,10 +1083,6 @@
     <w:uiPriority w:val="99"/>
     <w:semiHidden/>
     <w:unhideWhenUsed/>
-    <w:rPr>
-      <w:sz w:val="20"/>
-      <w:szCs w:val="20"/>
-    </w:rPr>
   </w:style>
   <w:style w:type="character" w:customStyle="1" w:styleId="EndnoteTextChar">
     <w:name w:val="Endnote Text Char"/>

</xml_diff>